<commit_message>
docs: aplica as correções de formatação apontadas pela equipe
- Quadros de caso de uso reestruturados como tabela única no formato do
  modelo (rótulos à esquerda, fluxo em duas colunas na mesma tabela).
- Larguras de coluna proporcionais por tipo de tabela (dicionário, fluxo,
  histórico) em vez de colunas iguais espremidas.
- Linhas de tabela indivisíveis entre páginas e título de Quadro/Tabela
  colado à tabela (docx); réguas horizontais removidas.
- Cabeçalho corrido 'capítulo … página' no Word (STYLEREF) e no PDF
  (fancyhdr), como no modelo; entrelinha 1,15 e respiro nas células.
- Sumário passa a abrir em página própria também quando o histórico
  transborda; some o prefixo duplicado 'Figura N:' nas legendas do PDF.
- Caixas de classe sem membros não desenham mais compartimentos vazios
  (Figura 17 e diagramas de comunicação mais limpos); marcador do
  Planning Poker redesenhado como texto simples.
- Investing.com citado na bibliografia e nas fontes de dados.
</commit_message>
<xml_diff>
--- a/ferramentas/referencia.docx
+++ b/ferramentas/referencia.docx
@@ -314,6 +314,7 @@
       </w:r>
     </w:p>
     <w:sectPr>
+      <w:headerReference w:type="default" r:id="rIdCabecalho"/>
       <w:footnotePr>
         <w:numRestart w:val="eachSect"/>
       </w:footnotePr>
@@ -367,6 +368,45 @@
     </w:p>
   </w:footnote>
 </w:footnotes>
+</file>
+
+<file path=word/header1.xml><?xml version="1.0" encoding="utf-8"?>
+<w:hdr xmlns:w="http://schemas.openxmlformats.org/wordprocessingml/2006/main" xmlns:r="http://schemas.openxmlformats.org/officeDocument/2006/relationships">
+  <w:p>
+    <w:pPr>
+      <w:pBdr>
+        <w:bottom w:val="single" w:sz="4" w:space="1" w:color="auto"/>
+      </w:pBdr>
+      <w:tabs>
+        <w:tab w:val="right" w:pos="9070"/>
+      </w:tabs>
+      <w:rPr>
+        <w:sz w:val="18"/>
+      </w:rPr>
+    </w:pPr>
+    <w:r>
+      <w:fldChar w:fldCharType="begin"/>
+    </w:r>
+    <w:r>
+      <w:instrText xml:space="preserve"> STYLEREF "Heading 1" \* MERGEFORMAT </w:instrText>
+    </w:r>
+    <w:r>
+      <w:fldChar w:fldCharType="end"/>
+    </w:r>
+    <w:r>
+      <w:tab/>
+    </w:r>
+    <w:r>
+      <w:fldChar w:fldCharType="begin"/>
+    </w:r>
+    <w:r>
+      <w:instrText xml:space="preserve"> PAGE </w:instrText>
+    </w:r>
+    <w:r>
+      <w:fldChar w:fldCharType="end"/>
+    </w:r>
+  </w:p>
+</w:hdr>
 </file>
 
 <file path=word/numbering.xml><?xml version="1.0" encoding="utf-8"?>
@@ -499,6 +539,9 @@
   </w:docDefaults>
   <w:latentStyles w:defLockedState="0" w:defUIPriority="0" w:defSemiHidden="0" w:defUnhideWhenUsed="0" w:defQFormat="0" w:count="276"/>
   <w:style w:type="paragraph" w:default="1" w:styleId="Normal">
+    <w:pPr>
+      <w:spacing w:line="276" w:lineRule="auto"/>
+    </w:pPr>
     <w:name w:val="Normal"/>
     <w:qFormat/>
   </w:style>
@@ -1014,6 +1057,14 @@
     <w:unhideWhenUsed/>
   </w:style>
   <w:style w:type="table" w:default="1" w:styleId="Table">
+    <w:tblPr>
+      <w:tblCellMar>
+        <w:top w:w="40" w:type="dxa"/>
+        <w:bottom w:w="40" w:type="dxa"/>
+        <w:left w:w="80" w:type="dxa"/>
+        <w:right w:w="80" w:type="dxa"/>
+      </w:tblCellMar>
+    </w:tblPr>
     <w:name w:val="Table"/>
     <w:basedOn w:val="TableNormal"/>
     <w:semiHidden/>

</xml_diff>